<commit_message>
Updated documents to make for easier deliverable integration.
</commit_message>
<xml_diff>
--- a/04_QA_Review/Approved/Milestone_5_Algorithms/SDD/JTS_M4_SDD_4.3ClassDesign_v01.docx
+++ b/04_QA_Review/Approved/Milestone_5_Algorithms/SDD/JTS_M4_SDD_4.3ClassDesign_v01.docx
@@ -108,52 +108,103 @@
     </w:p>
     <w:p>
       <w:pPr>
-        <w:keepNext/>
-        <w:widowControl w:val="0"/>
-        <w:spacing w:before="240" w:after="80" w:line="240" w:lineRule="auto"/>
-        <w:outlineLvl w:val="2"/>
-        <w:rPr>
-          <w:rFonts w:ascii="Arial" w:eastAsia="Arial" w:hAnsi="Arial" w:cs="Arial"/>
-          <w:b/>
-          <w:color w:val="000000"/>
-          <w:sz w:val="27"/>
-          <w:szCs w:val="26"/>
-          <w:lang w:eastAsia="en-US"/>
-        </w:rPr>
+        <w:pStyle w:val="135ptHeading"/>
       </w:pPr>
       <w:r>
-        <w:rPr>
-          <w:rFonts w:ascii="Arial" w:eastAsia="Arial" w:hAnsi="Arial" w:cs="Arial"/>
-          <w:b/>
-          <w:color w:val="000000"/>
-          <w:sz w:val="27"/>
-          <w:szCs w:val="26"/>
-          <w:lang w:eastAsia="en-US"/>
-        </w:rPr>
         <w:t>Class Diagrams – 1.</w:t>
       </w:r>
       <w:r>
-        <w:rPr>
-          <w:rFonts w:ascii="Arial" w:eastAsia="Arial" w:hAnsi="Arial" w:cs="Arial"/>
-          <w:b/>
-          <w:color w:val="000000"/>
-          <w:sz w:val="27"/>
-          <w:szCs w:val="26"/>
-          <w:lang w:eastAsia="en-US"/>
-        </w:rPr>
         <w:t>8</w:t>
       </w:r>
       <w:r>
-        <w:rPr>
-          <w:rFonts w:ascii="Arial" w:eastAsia="Arial" w:hAnsi="Arial" w:cs="Arial"/>
-          <w:b/>
-          <w:color w:val="000000"/>
-          <w:sz w:val="27"/>
-          <w:szCs w:val="26"/>
-          <w:lang w:eastAsia="en-US"/>
-        </w:rPr>
         <w:t xml:space="preserve"> Job Posting Service</w:t>
       </w:r>
+    </w:p>
+    <w:p>
+      <w:pPr>
+        <w:pStyle w:val="12ptHeading"/>
+      </w:pPr>
+      <w:r>
+        <w:t xml:space="preserve">1.8.1-CD </w:t>
+      </w:r>
+      <w:proofErr w:type="spellStart"/>
+      <w:r>
+        <w:t>AuthorizationService</w:t>
+      </w:r>
+      <w:proofErr w:type="spellEnd"/>
+      <w:r>
+        <w:t xml:space="preserve"> Class Diagram</w:t>
+      </w:r>
+    </w:p>
+    <w:p>
+      <w:pPr>
+        <w:pStyle w:val="BodyText"/>
+      </w:pPr>
+    </w:p>
+    <w:p>
+      <w:pPr>
+        <w:pStyle w:val="12ptHeading"/>
+      </w:pPr>
+      <w:r>
+        <w:t>1.</w:t>
+      </w:r>
+      <w:r>
+        <w:t>8</w:t>
+      </w:r>
+      <w:r>
+        <w:t>.</w:t>
+      </w:r>
+      <w:r>
+        <w:t>2</w:t>
+      </w:r>
+      <w:r>
+        <w:t xml:space="preserve">-CD </w:t>
+      </w:r>
+      <w:proofErr w:type="spellStart"/>
+      <w:r>
+        <w:t>JobPosting</w:t>
+      </w:r>
+      <w:proofErr w:type="spellEnd"/>
+      <w:r>
+        <w:t xml:space="preserve"> Class Diagram</w:t>
+      </w:r>
+    </w:p>
+    <w:p>
+      <w:pPr>
+        <w:pStyle w:val="BodyText"/>
+      </w:pPr>
+    </w:p>
+    <w:p>
+      <w:pPr>
+        <w:pStyle w:val="12ptHeading"/>
+      </w:pPr>
+      <w:r>
+        <w:t xml:space="preserve">1.8.3-CD </w:t>
+      </w:r>
+      <w:proofErr w:type="spellStart"/>
+      <w:r>
+        <w:t>PostValidator</w:t>
+      </w:r>
+      <w:proofErr w:type="spellEnd"/>
+      <w:r>
+        <w:t xml:space="preserve"> Class Diagram</w:t>
+      </w:r>
+    </w:p>
+    <w:p>
+      <w:pPr>
+        <w:pStyle w:val="BodyText"/>
+        <w:rPr>
+          <w:rFonts w:eastAsia="Arial"/>
+        </w:rPr>
+      </w:pPr>
+    </w:p>
+    <w:p>
+      <w:pPr>
+        <w:pStyle w:val="BodyText"/>
+        <w:rPr>
+          <w:rFonts w:eastAsia="Arial"/>
+        </w:rPr>
+      </w:pPr>
     </w:p>
     <w:p>
       <w:pPr>
@@ -2343,11 +2394,12 @@
   <w:style w:type="paragraph" w:customStyle="1" w:styleId="12ptHeading">
     <w:name w:val="12pt Heading"/>
     <w:basedOn w:val="Normal"/>
+    <w:next w:val="BodyText"/>
     <w:link w:val="12ptHeadingChar"/>
     <w:autoRedefine/>
     <w:uiPriority w:val="1"/>
     <w:qFormat/>
-    <w:rsid w:val="009C31F9"/>
+    <w:rsid w:val="007A5D56"/>
     <w:pPr>
       <w:keepNext/>
       <w:widowControl w:val="0"/>
@@ -2370,7 +2422,7 @@
     <w:basedOn w:val="DefaultParagraphFont"/>
     <w:link w:val="12ptHeading"/>
     <w:uiPriority w:val="1"/>
-    <w:rsid w:val="009C31F9"/>
+    <w:rsid w:val="007A5D56"/>
     <w:rPr>
       <w:rFonts w:ascii="Arial" w:eastAsia="Arial" w:hAnsi="Arial" w:cs="Arial"/>
       <w:b/>
@@ -2382,6 +2434,7 @@
   <w:style w:type="paragraph" w:customStyle="1" w:styleId="135ptHeading">
     <w:name w:val="13.5pt Heading"/>
     <w:basedOn w:val="12ptHeading"/>
+    <w:next w:val="BodyText"/>
     <w:link w:val="135ptHeadingChar"/>
     <w:autoRedefine/>
     <w:uiPriority w:val="1"/>

</xml_diff>